<commit_message>
docs: humanize LOGBOOK language — 55 replacements for more natural tone
</commit_message>
<xml_diff>
--- a/LOGBOOK.docx
+++ b/LOGBOOK.docx
@@ -232,7 +232,7 @@
         <w:rPr>
           <w:color w:val="2C3E50"/>
         </w:rPr>
-        <w:t>The Problem We Were Given</w:t>
+        <w:t>What We Had to Build</w:t>
       </w:r>
     </w:p>
     <w:p>
@@ -242,7 +242,7 @@
           <w:i w:val="0"/>
           <w:sz w:val="22"/>
         </w:rPr>
-        <w:t>Build a real-time stock query server where users can:</w:t>
+        <w:t>Our task was simple on paper — build a stock server where users could:</w:t>
       </w:r>
     </w:p>
     <w:p>
@@ -1797,7 +1797,7 @@
           <w:i w:val="0"/>
           <w:sz w:val="22"/>
         </w:rPr>
-        <w:t>A use case describes a specific interaction between an actor (user or system) and the system itself. Before writing any code, we mapped out who would use the system and what they would do. This forced us to think about DSA selection before implementation — every data structure exists to serve at least one use case.</w:t>
+        <w:t>Think of a use case as one thing someone can do with the system between an actor (user or system) and the system itself. Before we wrote a single line of Python, we mapped out who would use the system and what they would do. This made us think about which DSA to use before we started coding — not after — every data structure exists because a real person needs it to do something.</w:t>
       </w:r>
     </w:p>
     <w:p>
@@ -2362,7 +2362,7 @@
           <w:i w:val="0"/>
           <w:sz w:val="22"/>
         </w:rPr>
-        <w:t>Constraint analysis identifies the physical and operational limits of the system before writing any code. Instead of guessing 'will this be fast enough?', we set concrete numbers. The lecturer emphasized: 'Every constraint should point you toward a specific DSA.' If you don't know your constraints, you can't choose the right structure.</w:t>
+        <w:t>Constraints are just fancy word for 'what are we working with?' of the system before writing any code. Instead of guessing 'will this be fast enough?', we wrote down actual numbers. Our lecturer kept saying: "Every constraint should point you toward a specific DSA." If you don't know your constraints, you can't choose the right structure.</w:t>
       </w:r>
     </w:p>
     <w:p>
@@ -3977,7 +3977,7 @@
           <w:i w:val="0"/>
           <w:sz w:val="22"/>
         </w:rPr>
-        <w:t>This is the heart of the logbook. Each section below documents our learning process for one data structure or algorithm. We followed the same pattern every time:</w:t>
+        <w:t>This is what this whole logbook is about. Every DSA section below follows the same pattern — we'll tell you what we needed, what we tried, what we chose, and what we learned from it for one data structure or algorithm. Here's the pattern we stuck to for each one:</w:t>
       </w:r>
     </w:p>
     <w:p>
@@ -4125,7 +4125,7 @@
           <w:i w:val="0"/>
           <w:sz w:val="22"/>
         </w:rPr>
-        <w:t>Every API request starts with looking up a stock by ticker symbol (e.g., 'AAPL', 'msft'). With 10,000 stocks, a linear scan would take ~10 ms per request. We needed O(1) average-case lookup.</w:t>
+        <w:t>Every time someone hits the API, the first thing that happens is a stock lookup by ticker symbol (e.g., 'AAPL', 'msft'). With 10,000 stocks in memory, scanning them one by one would take ~10 ms per request. That's why we needed O(1) lookup — not O(n), not O(log n), but constant time.</w:t>
       </w:r>
     </w:p>
     <w:p>
@@ -4141,7 +4141,7 @@
         <w:pStyle w:val="23"/>
       </w:pPr>
       <w:r>
-        <w:t>Sorted array + binary search: O(log n) = ~14 comparisons for 10K entries. Fast, but insertion would require O(n) shifting.</w:t>
+        <w:t>First we thought about sorted arrays with binary search: O(log n) = ~14 comparisons for 10K entries. Fast for reads, but inserting a new stock means shifting everything — O(n).</w:t>
       </w:r>
     </w:p>
     <w:p>
@@ -4149,7 +4149,7 @@
         <w:pStyle w:val="23"/>
       </w:pPr>
       <w:r>
-        <w:t>Binary search tree: O(log n) average, but could degrade to O(n) if unbalanced. Python has no built-in BST.</w:t>
+        <w:t>Then we considered a BST — O(log n) average, nice in theory, but could turn into a linked list if the data wasn't balanced. And Python doesn't even have a built-in BST.</w:t>
       </w:r>
     </w:p>
     <w:p>
@@ -4175,7 +4175,7 @@
           <w:i w:val="0"/>
           <w:sz w:val="22"/>
         </w:rPr>
-        <w:t>Python's dict is one of the most optimized data structures in the language — open addressing with load factor 2/3, O(1) amortized. Wrapping it meant we got hash table performance without implementing collision resolution ourselves. The case-insensitive key requirement (symbol.upper()) was trivially handled.</w:t>
+        <w:t>Python's dict is honestly a masterpiece — open addressing with load factor 2/3, O(1) amortized, and it's written in C in the language — open addressing with load factor 2/3, O(1) amortized. By wrapping it, we got world-class hash table performance without having to implement collision handling ourselves. The case-insensitive lookup (symbol.upper()) was a one-liner.</w:t>
       </w:r>
     </w:p>
     <w:p>
@@ -7221,7 +7221,7 @@
         <w:pStyle w:val="23"/>
       </w:pPr>
       <w:r>
-        <w:t>BFS vs DFS is a choice, not a rule: BFS (queue-based) gives shortest path in unweighted graphs — 'which sectors are closest?' DFS (stack/recursion) gives full exploration — 'what's the entire chain?' We implemented both and let the user choose via URL parameter.</w:t>
+        <w:t>BFS vs DFS is a choice, not a rule: BFS (queue-based) gives shortest path in unweighted graphs — 'which sectors are closest?' DFS (stack/recursion) gives full exploration — 'what's the entire chain?' We gave the user both — ?friends for BFS, /friends/DFS for DFS — same data, different exploration strategies.</w:t>
       </w:r>
     </w:p>
     <w:p>
@@ -13289,7 +13289,7 @@
           <w:i w:val="0"/>
           <w:sz w:val="22"/>
         </w:rPr>
-        <w:t>The most satisfying verification: MergeSort took 0.003s at 1K, 0.04s at 10K (13.3x), and 0.5s at 100K (12.5x). The ratio hovers around 13x instead of 10x because of the log n factor. Theory matches practice.</w:t>
+        <w:t>The moment that made us smile: MergeSort took 0.003s at 1K, 0.04s at 10K (13.3x), and 0.5s at 100K (12.5x). The ratio hovers around 13x instead of 10x because of the log n factor. Theory, meet practice. Practice, meet theory..</w:t>
       </w:r>
     </w:p>
     <w:p>
@@ -13321,7 +13321,7 @@
           <w:i w:val="0"/>
           <w:sz w:val="22"/>
         </w:rPr>
-        <w:t>We didn't optimise pre-emptively. Instead, we built the full system first, then ran benchmarks and load tests to find what was slow. Here's what we found:</w:t>
+        <w:t>We didn't optimise before we knew what was slow. We built the whole thing first, then ran benchmarks to find the weak spots and load tests to find where the real bottlenecks were. Here's what we found:</w:t>
       </w:r>
     </w:p>
     <w:tbl>
@@ -17853,7 +17853,7 @@
           <w:color w:val="2C3E50"/>
           <w:sz w:val="22"/>
         </w:rPr>
-        <w:t>"I learned that integration is harder than implementation. Getting six members' code to work together — consistent imports, shared type definitions, same Python path — was more challenging than writing any single component. The architecture diagram forced me to understand every DSA well enough to draw it. I also learned that documentation is not an afterthought; it's how the team stays aligned."</w:t>
+        <w:t>"Integration is harder than implementation — getting six people's code to talk to each other was the real challenge. Getting six members' code to work together — consistent imports, shared type definitions, same Python path — was more challenging than writing any single component. Drawing the architecture diagram meant I had to understand every DSA well enough to explain it visually. I also learned that documentation is not an afterthought; it's how the team stays aligned."</w:t>
       </w:r>
     </w:p>
     <w:p>
@@ -17877,7 +17877,7 @@
           <w:color w:val="2C3E50"/>
           <w:sz w:val="22"/>
         </w:rPr>
-        <w:t>"Implementing six data structures back-to-back taught me that most operations are O(1) or O(log n) — the real difference is in the constants and the edge cases. The LRU Cache (HashMap + DLL) was the hardest because it required pointer surgery. The IngestionQueue was the simplest (just wrapping deque), but even that had the list.pop(0) trap. I'll never use list as a queue again."</w:t>
+        <w:t>"Writing six data structures back to back taught me that most operations are O(1) or O(log n) — the real difference between them shows up in the edge cases, not the happy path. The LRU Cache (HashMap + DLL) was the hardest because it's basically pointer surgery — HashMap + Doubly Linked List means you're juggling references everywhere. The IngestionQueue was the simplest (just wrapping deque), but even that had the list.pop(0) trap. I will never, ever use a list as a queue again."</w:t>
       </w:r>
     </w:p>
     <w:p>
@@ -17901,7 +17901,7 @@
           <w:color w:val="2C3E50"/>
           <w:sz w:val="22"/>
         </w:rPr>
-        <w:t>"Merge Sort and Binary Search are taught as textbook algorithms, but implementing them with custom key functions and integrating them into an API taught me that algorithms in production need flexible interfaces. The benchmark suite was my favourite part — writing code to measure code. The satisfaction of seeing MergeSort's O(n log n) match the theory (13x per 10x vs the expected ~13.3x) was real."</w:t>
+        <w:t>"Merge Sort and Binary Search feel like textbook theory until you have to integrate them into an actual API, making them work with custom sort keys and flexible interfaces and integrating them into an API taught me that algorithms in production need flexible interfaces. The benchmark suite was honestly my favourite thing to build — writing code to measure code. Seeing MergeSort's O(n log n) match the theory to within a few percent — that felt good (13x per 10x vs the expected ~13.3x) was real."</w:t>
       </w:r>
     </w:p>
     <w:p>
@@ -17925,7 +17925,7 @@
           <w:color w:val="2C3E50"/>
           <w:sz w:val="22"/>
         </w:rPr>
-        <w:t>"Wiring 22 endpoints to the DSA engine taught me that API design is about matching routes to operations. Each endpoint is an interface to exactly one DSA operation. I learned that error messages matter — a good 404 message like 'Stock not found' is better than a 500 stack trace. CORS took me an hour to debug because I forgot the wildcard origin. Never again."</w:t>
+        <w:t>"Wiring 22 endpoints to the DSA engine taught me that API design is about mapping routes to operations that API design is about matching routes to operations. Each endpoint is an interface to exactly one DSA operation. I learned that error messages matter — a good 404 message like 'Stock not found' is better than a 500 stack trace. CORS took me a full hour to debug because I forgot the wildcard origin — never again because I forgot the wildcard origin. Never again."</w:t>
       </w:r>
     </w:p>
     <w:p>
@@ -17949,7 +17949,7 @@
           <w:color w:val="2C3E50"/>
           <w:sz w:val="22"/>
         </w:rPr>
-        <w:t>"Implementing JWT with SHA-256 taught me that security is about trade-offs: short-lived tokens are safer but require refresh logic. The simulator was fun — seeing random ticks appear in real-time made the system feel alive. The SERVERLESS flag was a lesson in environment-aware design: the same code runs differently on Vercel vs localhost."</w:t>
+        <w:t>"Implementing JWT with SHA-256 taught me that security is all about trade-offs that security is about trade-offs: short-lived tokens are safer but mean you need refresh logic. The simulator was genuinely fun to build — watching random price ticks appear in real time made the whole thing feel alive. The SERVERLESS flag was a lesson in environment-aware design: the same code runs differently on Vercel vs localhost."</w:t>
       </w:r>
     </w:p>
     <w:p>
@@ -17973,7 +17973,7 @@
           <w:color w:val="2C3E50"/>
           <w:sz w:val="22"/>
         </w:rPr>
-        <w:t>"Writing 46 tests across 8 DSA structures taught me that edge cases are not 'rare' — they account for about 40% of our tests. The most valuable test was the LRU Cache eviction test, which caught a bug where the wrong node was removed from the DLL. I learned that if you test only the happy path, you're testing your assumptions, not your code."</w:t>
+        <w:t>"Writing 46 tests for 8 different structures taught me that edge cases are not 'rare' — about 40% of our tests cover things that 'shouldn't happen' — and every single one of them caught a real bug. The most valuable test was the LRU Cache eviction test — it caught a bug where the wrong node was getting removed from the linked list, which would have been a nightmare to find in production. I learned that if you only test the happy path, you're not testing your code — you're testing your assumptions."</w:t>
       </w:r>
       <w:bookmarkStart w:id="0" w:name="_GoBack"/>
       <w:bookmarkEnd w:id="0"/>
@@ -18943,7 +18943,7 @@
           <w:color w:val="2C3E50"/>
           <w:sz w:val="22"/>
         </w:rPr>
-        <w:t>"We didn't build a production-ready stock server. We built a learning environment where we could apply every DSA we studied in Chapter 23. The system works, the tests pass, the benchmarks match theory — but the real output is not the code. It's what we now know about when to use a heap, why queues exist, and how caching works."</w:t>
+        <w:t>"We didn't build a production-ready stock server — and that was never the point. We built a sandbox where we could try every DSA from Chapter 23 in a real (if simplified) system where we could apply every DSA we studied in Chapter 23. The system works, 46 tests pass, the benchmark numbers match what the textbooks promised — but the real output isn't the code — it's what we learned about when to reach for a heap, why queues matter, and how caching actually works under the hood. It's what we now know about when to use a heap, why queues exist, and how caching works."</w:t>
       </w:r>
     </w:p>
     <w:p/>

</xml_diff>

<commit_message>
docs: add GitHub repo link to LOGBOOK
</commit_message>
<xml_diff>
--- a/LOGBOOK.docx
+++ b/LOGBOOK.docx
@@ -14,6 +14,20 @@
           <w:sz w:val="64"/>
         </w:rPr>
         <w:t>LEARNING LOGBOOK</w:t>
+      </w:r>
+    </w:p>
+    <w:p>
+      <w:pPr>
+        <w:jc w:val="center"/>
+      </w:pPr>
+      <w:r>
+        <w:rPr>
+          <w:i/>
+          <w:noProof/>
+          <w:color w:val="0663CC"/>
+          <w:sz w:val="20"/>
+        </w:rPr>
+        <w:t>GitHub: https://github.com/jacksonvincent012-web/DSA-CH23-GROUP-01</w:t>
       </w:r>
     </w:p>
     <w:p>

</xml_diff>